<commit_message>
Add executable econometric analysis workflows
</commit_message>
<xml_diff>
--- a/econometric-research-writing/assets/econ-paper-template.docx
+++ b/econometric-research-writing/assets/econ-paper-template.docx
@@ -379,7 +379,7 @@
       <w:spacing w:line="276" w:lineRule="auto" w:after="120"/>
     </w:pPr>
     <w:rPr>
-      <w:rFonts w:ascii="Times New Roman" w:hAnsi="Times New Roman"/>
+      <w:rFonts w:ascii="Times New Roman" w:hAnsi="Times New Roman" w:cs="Times New Roman" w:eastAsia="Times New Roman"/>
       <w:sz w:val="24"/>
     </w:rPr>
   </w:style>
@@ -442,7 +442,7 @@
       <w:outlineLvl w:val="0"/>
     </w:pPr>
     <w:rPr>
-      <w:rFonts w:asciiTheme="majorHAnsi" w:eastAsiaTheme="majorEastAsia" w:hAnsiTheme="majorHAnsi" w:cstheme="majorBidi" w:ascii="Times New Roman" w:hAnsi="Times New Roman"/>
+      <w:rFonts w:asciiTheme="majorHAnsi" w:eastAsiaTheme="majorEastAsia" w:hAnsiTheme="majorHAnsi" w:cstheme="majorBidi" w:ascii="Times New Roman" w:hAnsi="Times New Roman" w:cs="Times New Roman" w:eastAsia="Times New Roman"/>
       <w:b/>
       <w:bCs/>
       <w:color w:val="000000"/>
@@ -466,7 +466,7 @@
       <w:outlineLvl w:val="1"/>
     </w:pPr>
     <w:rPr>
-      <w:rFonts w:asciiTheme="majorHAnsi" w:eastAsiaTheme="majorEastAsia" w:hAnsiTheme="majorHAnsi" w:cstheme="majorBidi" w:ascii="Times New Roman" w:hAnsi="Times New Roman"/>
+      <w:rFonts w:asciiTheme="majorHAnsi" w:eastAsiaTheme="majorEastAsia" w:hAnsiTheme="majorHAnsi" w:cstheme="majorBidi" w:ascii="Times New Roman" w:hAnsi="Times New Roman" w:cs="Times New Roman" w:eastAsia="Times New Roman"/>
       <w:b/>
       <w:bCs/>
       <w:color w:val="000000"/>
@@ -490,7 +490,7 @@
       <w:outlineLvl w:val="2"/>
     </w:pPr>
     <w:rPr>
-      <w:rFonts w:asciiTheme="majorHAnsi" w:eastAsiaTheme="majorEastAsia" w:hAnsiTheme="majorHAnsi" w:cstheme="majorBidi" w:ascii="Times New Roman" w:hAnsi="Times New Roman"/>
+      <w:rFonts w:asciiTheme="majorHAnsi" w:eastAsiaTheme="majorEastAsia" w:hAnsiTheme="majorHAnsi" w:cstheme="majorBidi" w:ascii="Times New Roman" w:hAnsi="Times New Roman" w:cs="Times New Roman" w:eastAsia="Times New Roman"/>
       <w:b/>
       <w:bCs/>
       <w:color w:val="000000"/>
@@ -725,14 +725,11 @@
     <w:qFormat/>
     <w:rsid w:val="00FC693F"/>
     <w:pPr>
-      <w:pBdr>
-        <w:bottom w:val="single" w:sz="8" w:space="4" w:color="4F81BD" w:themeColor="accent1"/>
-      </w:pBdr>
       <w:spacing w:after="300" w:line="240" w:lineRule="auto"/>
       <w:contextualSpacing/>
     </w:pPr>
     <w:rPr>
-      <w:rFonts w:asciiTheme="majorHAnsi" w:eastAsiaTheme="majorEastAsia" w:hAnsiTheme="majorHAnsi" w:cstheme="majorBidi" w:ascii="Times New Roman" w:hAnsi="Times New Roman"/>
+      <w:rFonts w:asciiTheme="majorHAnsi" w:eastAsiaTheme="majorEastAsia" w:hAnsiTheme="majorHAnsi" w:cstheme="majorBidi" w:ascii="Times New Roman" w:hAnsi="Times New Roman" w:cs="Times New Roman" w:eastAsia="Times New Roman"/>
       <w:b/>
       <w:color w:val="000000"/>
       <w:spacing w:val="5"/>
@@ -770,10 +767,11 @@
       </w:numPr>
     </w:pPr>
     <w:rPr>
-      <w:rFonts w:asciiTheme="majorHAnsi" w:eastAsiaTheme="majorEastAsia" w:hAnsiTheme="majorHAnsi" w:cstheme="majorBidi"/>
+      <w:rFonts w:asciiTheme="majorHAnsi" w:eastAsiaTheme="majorEastAsia" w:hAnsiTheme="majorHAnsi" w:cstheme="majorBidi" w:ascii="Times New Roman" w:hAnsi="Times New Roman" w:cs="Times New Roman" w:eastAsia="Times New Roman"/>
+      <w:b w:val="0"/>
       <w:i/>
       <w:iCs/>
-      <w:color w:val="4F81BD" w:themeColor="accent1"/>
+      <w:color w:val="000000"/>
       <w:spacing w:val="15"/>
       <w:sz w:val="24"/>
       <w:szCs w:val="24"/>
@@ -1175,10 +1173,11 @@
       <w:spacing w:line="240" w:lineRule="auto"/>
     </w:pPr>
     <w:rPr>
-      <w:b/>
+      <w:rFonts w:ascii="Times New Roman" w:hAnsi="Times New Roman" w:cs="Times New Roman" w:eastAsia="Times New Roman"/>
+      <w:b w:val="0"/>
       <w:bCs/>
-      <w:color w:val="4F81BD" w:themeColor="accent1"/>
-      <w:sz w:val="18"/>
+      <w:color w:val="000000"/>
+      <w:sz w:val="20"/>
       <w:szCs w:val="18"/>
     </w:rPr>
   </w:style>

</xml_diff>